<commit_message>
Define límites de peso reales y deja solo el furgón como vehículo de reparto
- Camión Buenos Aires → Santiago: límite de 2.000 kg (antes 200)
- Furgón de reparto por zona: 600 kg por salida; lo que no entra queda en sucursal para la próxima salida de la zona, y "Preparar reparto" muestra la carga del furgón y los paquetes que esperan
- Casa Central rechaza un paquete a domicilio de más de 600 kg (no entraría en el furgón)
- Vehículos: solo tipo Furgón (se sacan moto, auto y camioneta); migración que pasa los existentes a furgón
- Actualiza el plan de pruebas con los nuevos límites, vehículos y los casos CC-08 y EMP-11

Co-Authored-By: Claude Sonnet 5.5 <noreply@anthropic.com>
</commit_message>
<xml_diff>
--- a/Plan_de_Pruebas_Santa_Marta.docx
+++ b/Plan_de_Pruebas_Santa_Marta.docx
@@ -144,7 +144,7 @@
           <w:sz w:val="22"/>
           <w:lang w:val="es-AR"/>
         </w:rPr>
-        <w:t>Septiembre de 2026</w:t>
+        <w:t>Octubre de 2026</w:t>
       </w:r>
     </w:p>
     <w:p>
@@ -2200,7 +2200,7 @@
               <w:rPr>
                 <w:sz w:val="18"/>
               </w:rPr>
-              <w:t>Toyota</w:t>
+              <w:t>Renault</w:t>
             </w:r>
           </w:p>
         </w:tc>
@@ -2223,7 +2223,7 @@
               <w:rPr>
                 <w:sz w:val="18"/>
               </w:rPr>
-              <w:t>Hilux</w:t>
+              <w:t>Kangoo</w:t>
             </w:r>
           </w:p>
         </w:tc>
@@ -2246,7 +2246,7 @@
               <w:rPr>
                 <w:sz w:val="18"/>
               </w:rPr>
-              <w:t>Camioneta</w:t>
+              <w:t>Furgón</w:t>
             </w:r>
           </w:p>
         </w:tc>
@@ -2269,7 +2269,7 @@
               <w:rPr>
                 <w:sz w:val="18"/>
               </w:rPr>
-              <w:t>lautaromoreno</w:t>
+              <w:t>Sofía Lattanzio (una vez creada)</w:t>
             </w:r>
           </w:p>
         </w:tc>
@@ -2320,7 +2320,7 @@
               <w:rPr>
                 <w:sz w:val="18"/>
               </w:rPr>
-              <w:t>Honda</w:t>
+              <w:t>Fiat</w:t>
             </w:r>
           </w:p>
         </w:tc>
@@ -2343,7 +2343,7 @@
               <w:rPr>
                 <w:sz w:val="18"/>
               </w:rPr>
-              <w:t>Wave 110</w:t>
+              <w:t>Fiorino</w:t>
             </w:r>
           </w:p>
         </w:tc>
@@ -2366,7 +2366,7 @@
               <w:rPr>
                 <w:sz w:val="18"/>
               </w:rPr>
-              <w:t>Moto</w:t>
+              <w:t>Furgón</w:t>
             </w:r>
           </w:p>
         </w:tc>
@@ -2393,7 +2393,7 @@
                 <w:sz w:val="18"/>
                 <w:lang w:val="es-AR"/>
               </w:rPr>
-              <w:t>Sofía Lattanzio (una vez creada)</w:t>
+              <w:t>Sin asignar (lautaromoreno ya tiene el furgón AC522ZI)</w:t>
             </w:r>
           </w:p>
         </w:tc>
@@ -2444,7 +2444,7 @@
           <w:sz w:val="19"/>
           <w:lang w:val="es-AR"/>
         </w:rPr>
-        <w:t>Pensados para poder probar el límite de 200 kg por camión: los primeros cuatro suman 150 kg y quedan en el mismo camión; el quinto (70 kg) hace que el sistema abra un camión nuevo en forma automática (150 + 70 = 220 kg &gt; 200 kg). El sexto sirve para comprobar que un paquete que por sí solo supera el límite queda rechazado.</w:t>
+        <w:t>Pensados para probar los dos límites de peso. Camión Buenos Aires → Santiago (2.000 kg): los envíos #1 a #3 suman 1.800 kg y quedan en el mismo camión; el #4 (300 kg) hace que el sistema abra un camión nuevo (1.800 + 300 = 2.100 kg &gt; 2.000 kg). Furgón de reparto (600 kg): los envíos #4, #5 y #6 son a domicilio y deben tener dirección en la misma zona (si el sistema no la ubica solo, asignarla a mano); suman 750 kg, así que en una salida entran dos y el tercero espera a la próxima. Los envíos #7 y #8 sirven para comprobar los rechazos: uno supera los 2.000 kg del camión y el otro, a domicilio, no entra en el furgón de 600 kg. Si ya hay otro camión cargándose, sus kilos se suman a la cuenta.</w:t>
       </w:r>
     </w:p>
     <w:tbl>
@@ -2719,7 +2719,7 @@
               <w:rPr>
                 <w:sz w:val="18"/>
               </w:rPr>
-              <w:t>Heladera compacta</w:t>
+              <w:t>Pallet de electrodomésticos</w:t>
             </w:r>
           </w:p>
         </w:tc>
@@ -2742,7 +2742,7 @@
               <w:rPr>
                 <w:sz w:val="18"/>
               </w:rPr>
-              <w:t>45</w:t>
+              <w:t>600</w:t>
             </w:r>
           </w:p>
         </w:tc>
@@ -2765,7 +2765,7 @@
               <w:rPr>
                 <w:sz w:val="18"/>
               </w:rPr>
-              <w:t>25000</w:t>
+              <w:t>90000</w:t>
             </w:r>
           </w:p>
         </w:tc>
@@ -2788,7 +2788,7 @@
               <w:rPr>
                 <w:sz w:val="18"/>
               </w:rPr>
-              <w:t>Domicilio</w:t>
+              <w:t>Retiro en sucursal</w:t>
             </w:r>
           </w:p>
         </w:tc>
@@ -2885,7 +2885,7 @@
               <w:rPr>
                 <w:sz w:val="18"/>
               </w:rPr>
-              <w:t>Caja de libros</w:t>
+              <w:t>Pallet de libros</w:t>
             </w:r>
           </w:p>
         </w:tc>
@@ -2908,7 +2908,7 @@
               <w:rPr>
                 <w:sz w:val="18"/>
               </w:rPr>
-              <w:t>40</w:t>
+              <w:t>600</w:t>
             </w:r>
           </w:p>
         </w:tc>
@@ -2931,7 +2931,7 @@
               <w:rPr>
                 <w:sz w:val="18"/>
               </w:rPr>
-              <w:t>8000</w:t>
+              <w:t>40000</w:t>
             </w:r>
           </w:p>
         </w:tc>
@@ -2954,7 +2954,7 @@
               <w:rPr>
                 <w:sz w:val="18"/>
               </w:rPr>
-              <w:t>Domicilio</w:t>
+              <w:t>Retiro en sucursal</w:t>
             </w:r>
           </w:p>
         </w:tc>
@@ -3051,7 +3051,7 @@
               <w:rPr>
                 <w:sz w:val="18"/>
               </w:rPr>
-              <w:t>Notebook 15”</w:t>
+              <w:t>Máquina de coser industrial</w:t>
             </w:r>
           </w:p>
         </w:tc>
@@ -3074,7 +3074,7 @@
               <w:rPr>
                 <w:sz w:val="18"/>
               </w:rPr>
-              <w:t>5</w:t>
+              <w:t>600</w:t>
             </w:r>
           </w:p>
         </w:tc>
@@ -3097,7 +3097,7 @@
               <w:rPr>
                 <w:sz w:val="18"/>
               </w:rPr>
-              <w:t>15000</w:t>
+              <w:t>70000</w:t>
             </w:r>
           </w:p>
         </w:tc>
@@ -3143,7 +3143,7 @@
               <w:rPr>
                 <w:sz w:val="18"/>
               </w:rPr>
-              <w:t>Camión 1 · pago con tarjeta</w:t>
+              <w:t>Camión 1 (acumula 1.800 kg) · pago con tarjeta</w:t>
             </w:r>
           </w:p>
         </w:tc>
@@ -3217,7 +3217,7 @@
               <w:rPr>
                 <w:sz w:val="18"/>
               </w:rPr>
-              <w:t>Televisor 55”</w:t>
+              <w:t>Muebles desarmados</w:t>
             </w:r>
           </w:p>
         </w:tc>
@@ -3240,7 +3240,7 @@
               <w:rPr>
                 <w:sz w:val="18"/>
               </w:rPr>
-              <w:t>60</w:t>
+              <w:t>300</w:t>
             </w:r>
           </w:p>
         </w:tc>
@@ -3309,7 +3309,7 @@
               <w:rPr>
                 <w:sz w:val="18"/>
               </w:rPr>
-              <w:t>Camión 1 (acumula 150 kg)</w:t>
+              <w:t>Abre Camión 2 (1.800+300=2.100 kg) · furgón</w:t>
             </w:r>
           </w:p>
         </w:tc>
@@ -3383,7 +3383,7 @@
               <w:rPr>
                 <w:sz w:val="18"/>
               </w:rPr>
-              <w:t>Ropero desarmado</w:t>
+              <w:t>Cajas de vajilla</w:t>
             </w:r>
           </w:p>
         </w:tc>
@@ -3406,7 +3406,7 @@
               <w:rPr>
                 <w:sz w:val="18"/>
               </w:rPr>
-              <w:t>70</w:t>
+              <w:t>250</w:t>
             </w:r>
           </w:p>
         </w:tc>
@@ -3429,7 +3429,7 @@
               <w:rPr>
                 <w:sz w:val="18"/>
               </w:rPr>
-              <w:t>12000</w:t>
+              <w:t>15000</w:t>
             </w:r>
           </w:p>
         </w:tc>
@@ -3475,7 +3475,7 @@
               <w:rPr>
                 <w:sz w:val="18"/>
               </w:rPr>
-              <w:t>Abre Camión 2 (150+70=220 kg)</w:t>
+              <w:t>Camión 2 · furgón</w:t>
             </w:r>
           </w:p>
         </w:tc>
@@ -3526,6 +3526,176 @@
               <w:rPr>
                 <w:sz w:val="18"/>
               </w:rPr>
+              <w:t>28555666 — Diego Ramírez</w:t>
+            </w:r>
+          </w:p>
+        </w:tc>
+        <w:tc>
+          <w:tcPr>
+            <w:tcW w:w="2551" w:type="dxa"/>
+            <w:tcBorders>
+              <w:top w:val="single" w:sz="4" w:space="0" w:color="B9C7D8"/>
+              <w:left w:val="single" w:sz="4" w:space="0" w:color="B9C7D8"/>
+              <w:bottom w:val="single" w:sz="4" w:space="0" w:color="B9C7D8"/>
+              <w:right w:val="single" w:sz="4" w:space="0" w:color="B9C7D8"/>
+            </w:tcBorders>
+            <w:shd w:val="clear" w:color="auto" w:fill="F3F7FC"/>
+          </w:tcPr>
+          <w:p>
+            <w:pPr>
+              <w:spacing w:before="20" w:after="20"/>
+            </w:pPr>
+            <w:r>
+              <w:rPr>
+                <w:sz w:val="18"/>
+              </w:rPr>
+              <w:t>Caja de herramientas</w:t>
+            </w:r>
+          </w:p>
+        </w:tc>
+        <w:tc>
+          <w:tcPr>
+            <w:tcW w:w="1361" w:type="dxa"/>
+            <w:tcBorders>
+              <w:top w:val="single" w:sz="4" w:space="0" w:color="B9C7D8"/>
+              <w:left w:val="single" w:sz="4" w:space="0" w:color="B9C7D8"/>
+              <w:bottom w:val="single" w:sz="4" w:space="0" w:color="B9C7D8"/>
+              <w:right w:val="single" w:sz="4" w:space="0" w:color="B9C7D8"/>
+            </w:tcBorders>
+            <w:shd w:val="clear" w:color="auto" w:fill="F3F7FC"/>
+          </w:tcPr>
+          <w:p>
+            <w:pPr>
+              <w:spacing w:before="20" w:after="20"/>
+            </w:pPr>
+            <w:r>
+              <w:rPr>
+                <w:sz w:val="18"/>
+              </w:rPr>
+              <w:t>200</w:t>
+            </w:r>
+          </w:p>
+        </w:tc>
+        <w:tc>
+          <w:tcPr>
+            <w:tcW w:w="1474" w:type="dxa"/>
+            <w:tcBorders>
+              <w:top w:val="single" w:sz="4" w:space="0" w:color="B9C7D8"/>
+              <w:left w:val="single" w:sz="4" w:space="0" w:color="B9C7D8"/>
+              <w:bottom w:val="single" w:sz="4" w:space="0" w:color="B9C7D8"/>
+              <w:right w:val="single" w:sz="4" w:space="0" w:color="B9C7D8"/>
+            </w:tcBorders>
+            <w:shd w:val="clear" w:color="auto" w:fill="F3F7FC"/>
+          </w:tcPr>
+          <w:p>
+            <w:pPr>
+              <w:spacing w:before="20" w:after="20"/>
+            </w:pPr>
+            <w:r>
+              <w:rPr>
+                <w:sz w:val="18"/>
+              </w:rPr>
+              <w:t>12000</w:t>
+            </w:r>
+          </w:p>
+        </w:tc>
+        <w:tc>
+          <w:tcPr>
+            <w:tcW w:w="2381" w:type="dxa"/>
+            <w:tcBorders>
+              <w:top w:val="single" w:sz="4" w:space="0" w:color="B9C7D8"/>
+              <w:left w:val="single" w:sz="4" w:space="0" w:color="B9C7D8"/>
+              <w:bottom w:val="single" w:sz="4" w:space="0" w:color="B9C7D8"/>
+              <w:right w:val="single" w:sz="4" w:space="0" w:color="B9C7D8"/>
+            </w:tcBorders>
+            <w:shd w:val="clear" w:color="auto" w:fill="F3F7FC"/>
+          </w:tcPr>
+          <w:p>
+            <w:pPr>
+              <w:spacing w:before="20" w:after="20"/>
+            </w:pPr>
+            <w:r>
+              <w:rPr>
+                <w:sz w:val="18"/>
+              </w:rPr>
+              <w:t>Domicilio</w:t>
+            </w:r>
+          </w:p>
+        </w:tc>
+        <w:tc>
+          <w:tcPr>
+            <w:tcW w:w="3458" w:type="dxa"/>
+            <w:tcBorders>
+              <w:top w:val="single" w:sz="4" w:space="0" w:color="B9C7D8"/>
+              <w:left w:val="single" w:sz="4" w:space="0" w:color="B9C7D8"/>
+              <w:bottom w:val="single" w:sz="4" w:space="0" w:color="B9C7D8"/>
+              <w:right w:val="single" w:sz="4" w:space="0" w:color="B9C7D8"/>
+            </w:tcBorders>
+            <w:shd w:val="clear" w:color="auto" w:fill="F3F7FC"/>
+          </w:tcPr>
+          <w:p>
+            <w:pPr>
+              <w:spacing w:before="20" w:after="20"/>
+              <w:rPr>
+                <w:lang w:val="es-AR"/>
+              </w:rPr>
+            </w:pPr>
+            <w:r>
+              <w:rPr>
+                <w:sz w:val="18"/>
+                <w:lang w:val="es-AR"/>
+              </w:rPr>
+              <w:t>Camión 2 · furgón (los 3 suman 750 kg)</w:t>
+            </w:r>
+          </w:p>
+        </w:tc>
+      </w:tr>
+      <w:tr>
+        <w:trPr>
+          <w:jc w:val="center"/>
+        </w:trPr>
+        <w:tc>
+          <w:tcPr>
+            <w:tcW w:w="680" w:type="dxa"/>
+            <w:tcBorders>
+              <w:top w:val="single" w:sz="4" w:space="0" w:color="B9C7D8"/>
+              <w:left w:val="single" w:sz="4" w:space="0" w:color="B9C7D8"/>
+              <w:bottom w:val="single" w:sz="4" w:space="0" w:color="B9C7D8"/>
+              <w:right w:val="single" w:sz="4" w:space="0" w:color="B9C7D8"/>
+            </w:tcBorders>
+            <w:shd w:val="clear" w:color="auto" w:fill="FFFFFF"/>
+          </w:tcPr>
+          <w:p>
+            <w:pPr>
+              <w:spacing w:before="20" w:after="20"/>
+            </w:pPr>
+            <w:r>
+              <w:rPr>
+                <w:sz w:val="18"/>
+              </w:rPr>
+              <w:t>7</w:t>
+            </w:r>
+          </w:p>
+        </w:tc>
+        <w:tc>
+          <w:tcPr>
+            <w:tcW w:w="3402" w:type="dxa"/>
+            <w:tcBorders>
+              <w:top w:val="single" w:sz="4" w:space="0" w:color="B9C7D8"/>
+              <w:left w:val="single" w:sz="4" w:space="0" w:color="B9C7D8"/>
+              <w:bottom w:val="single" w:sz="4" w:space="0" w:color="B9C7D8"/>
+              <w:right w:val="single" w:sz="4" w:space="0" w:color="B9C7D8"/>
+            </w:tcBorders>
+            <w:shd w:val="clear" w:color="auto" w:fill="FFFFFF"/>
+          </w:tcPr>
+          <w:p>
+            <w:pPr>
+              <w:spacing w:before="20" w:after="20"/>
+            </w:pPr>
+            <w:r>
+              <w:rPr>
+                <w:sz w:val="18"/>
+              </w:rPr>
               <w:t>29888999 — Rocío Paz</w:t>
             </w:r>
           </w:p>
@@ -3539,6 +3709,126 @@
               <w:bottom w:val="single" w:sz="4" w:space="0" w:color="B9C7D8"/>
               <w:right w:val="single" w:sz="4" w:space="0" w:color="B9C7D8"/>
             </w:tcBorders>
+            <w:shd w:val="clear" w:color="auto" w:fill="FFFFFF"/>
+          </w:tcPr>
+          <w:p>
+            <w:pPr>
+              <w:spacing w:before="20" w:after="20"/>
+            </w:pPr>
+            <w:r>
+              <w:rPr>
+                <w:sz w:val="18"/>
+              </w:rPr>
+              <w:t>Máquina industrial</w:t>
+            </w:r>
+          </w:p>
+        </w:tc>
+        <w:tc>
+          <w:tcPr>
+            <w:tcW w:w="1361" w:type="dxa"/>
+            <w:tcBorders>
+              <w:top w:val="single" w:sz="4" w:space="0" w:color="B9C7D8"/>
+              <w:left w:val="single" w:sz="4" w:space="0" w:color="B9C7D8"/>
+              <w:bottom w:val="single" w:sz="4" w:space="0" w:color="B9C7D8"/>
+              <w:right w:val="single" w:sz="4" w:space="0" w:color="B9C7D8"/>
+            </w:tcBorders>
+            <w:shd w:val="clear" w:color="auto" w:fill="FFFFFF"/>
+          </w:tcPr>
+          <w:p>
+            <w:pPr>
+              <w:spacing w:before="20" w:after="20"/>
+            </w:pPr>
+            <w:r>
+              <w:rPr>
+                <w:sz w:val="18"/>
+              </w:rPr>
+              <w:t>2500</w:t>
+            </w:r>
+          </w:p>
+        </w:tc>
+        <w:tc>
+          <w:tcPr>
+            <w:tcW w:w="1474" w:type="dxa"/>
+            <w:tcBorders>
+              <w:top w:val="single" w:sz="4" w:space="0" w:color="B9C7D8"/>
+              <w:left w:val="single" w:sz="4" w:space="0" w:color="B9C7D8"/>
+              <w:bottom w:val="single" w:sz="4" w:space="0" w:color="B9C7D8"/>
+              <w:right w:val="single" w:sz="4" w:space="0" w:color="B9C7D8"/>
+            </w:tcBorders>
+            <w:shd w:val="clear" w:color="auto" w:fill="FFFFFF"/>
+          </w:tcPr>
+          <w:p>
+            <w:pPr>
+              <w:spacing w:before="20" w:after="20"/>
+            </w:pPr>
+            <w:r>
+              <w:rPr>
+                <w:sz w:val="18"/>
+              </w:rPr>
+              <w:t>300000</w:t>
+            </w:r>
+          </w:p>
+        </w:tc>
+        <w:tc>
+          <w:tcPr>
+            <w:tcW w:w="2381" w:type="dxa"/>
+            <w:tcBorders>
+              <w:top w:val="single" w:sz="4" w:space="0" w:color="B9C7D8"/>
+              <w:left w:val="single" w:sz="4" w:space="0" w:color="B9C7D8"/>
+              <w:bottom w:val="single" w:sz="4" w:space="0" w:color="B9C7D8"/>
+              <w:right w:val="single" w:sz="4" w:space="0" w:color="B9C7D8"/>
+            </w:tcBorders>
+            <w:shd w:val="clear" w:color="auto" w:fill="FFFFFF"/>
+          </w:tcPr>
+          <w:p>
+            <w:pPr>
+              <w:spacing w:before="20" w:after="20"/>
+            </w:pPr>
+            <w:r>
+              <w:rPr>
+                <w:sz w:val="18"/>
+              </w:rPr>
+              <w:t>Retiro en sucursal</w:t>
+            </w:r>
+          </w:p>
+        </w:tc>
+        <w:tc>
+          <w:tcPr>
+            <w:tcW w:w="3458" w:type="dxa"/>
+            <w:tcBorders>
+              <w:top w:val="single" w:sz="4" w:space="0" w:color="B9C7D8"/>
+              <w:left w:val="single" w:sz="4" w:space="0" w:color="B9C7D8"/>
+              <w:bottom w:val="single" w:sz="4" w:space="0" w:color="B9C7D8"/>
+              <w:right w:val="single" w:sz="4" w:space="0" w:color="B9C7D8"/>
+            </w:tcBorders>
+            <w:shd w:val="clear" w:color="auto" w:fill="FFFFFF"/>
+          </w:tcPr>
+          <w:p>
+            <w:pPr>
+              <w:spacing w:before="20" w:after="20"/>
+            </w:pPr>
+            <w:r>
+              <w:rPr>
+                <w:sz w:val="18"/>
+              </w:rPr>
+              <w:t>Debe ser rechazado (supera 2.000 kg)</w:t>
+            </w:r>
+          </w:p>
+        </w:tc>
+      </w:tr>
+      <w:tr>
+        <w:trPr>
+          <w:jc w:val="center"/>
+        </w:trPr>
+        <w:tc>
+          <w:tcPr>
+            <w:tcW w:w="680" w:type="dxa"/>
+            <w:tcBorders>
+              <w:top w:val="single" w:sz="4" w:space="0" w:color="B9C7D8"/>
+              <w:left w:val="single" w:sz="4" w:space="0" w:color="B9C7D8"/>
+              <w:bottom w:val="single" w:sz="4" w:space="0" w:color="B9C7D8"/>
+              <w:right w:val="single" w:sz="4" w:space="0" w:color="B9C7D8"/>
+            </w:tcBorders>
             <w:shd w:val="clear" w:color="auto" w:fill="F3F7FC"/>
           </w:tcPr>
           <w:p>
@@ -3549,7 +3839,53 @@
               <w:rPr>
                 <w:sz w:val="18"/>
               </w:rPr>
-              <w:t>Máquina industrial</w:t>
+              <w:t>8</w:t>
+            </w:r>
+          </w:p>
+        </w:tc>
+        <w:tc>
+          <w:tcPr>
+            <w:tcW w:w="3402" w:type="dxa"/>
+            <w:tcBorders>
+              <w:top w:val="single" w:sz="4" w:space="0" w:color="B9C7D8"/>
+              <w:left w:val="single" w:sz="4" w:space="0" w:color="B9C7D8"/>
+              <w:bottom w:val="single" w:sz="4" w:space="0" w:color="B9C7D8"/>
+              <w:right w:val="single" w:sz="4" w:space="0" w:color="B9C7D8"/>
+            </w:tcBorders>
+            <w:shd w:val="clear" w:color="auto" w:fill="F3F7FC"/>
+          </w:tcPr>
+          <w:p>
+            <w:pPr>
+              <w:spacing w:before="20" w:after="20"/>
+            </w:pPr>
+            <w:r>
+              <w:rPr>
+                <w:sz w:val="18"/>
+              </w:rPr>
+              <w:t>29888999 — Rocío Paz</w:t>
+            </w:r>
+          </w:p>
+        </w:tc>
+        <w:tc>
+          <w:tcPr>
+            <w:tcW w:w="2551" w:type="dxa"/>
+            <w:tcBorders>
+              <w:top w:val="single" w:sz="4" w:space="0" w:color="B9C7D8"/>
+              <w:left w:val="single" w:sz="4" w:space="0" w:color="B9C7D8"/>
+              <w:bottom w:val="single" w:sz="4" w:space="0" w:color="B9C7D8"/>
+              <w:right w:val="single" w:sz="4" w:space="0" w:color="B9C7D8"/>
+            </w:tcBorders>
+            <w:shd w:val="clear" w:color="auto" w:fill="F3F7FC"/>
+          </w:tcPr>
+          <w:p>
+            <w:pPr>
+              <w:spacing w:before="20" w:after="20"/>
+            </w:pPr>
+            <w:r>
+              <w:rPr>
+                <w:sz w:val="18"/>
+              </w:rPr>
+              <w:t>Prensa hidráulica</w:t>
             </w:r>
           </w:p>
         </w:tc>
@@ -3572,7 +3908,7 @@
               <w:rPr>
                 <w:sz w:val="18"/>
               </w:rPr>
-              <w:t>250</w:t>
+              <w:t>700</w:t>
             </w:r>
           </w:p>
         </w:tc>
@@ -3595,7 +3931,7 @@
               <w:rPr>
                 <w:sz w:val="18"/>
               </w:rPr>
-              <w:t>60000</w:t>
+              <w:t>80000</w:t>
             </w:r>
           </w:p>
         </w:tc>
@@ -3645,7 +3981,7 @@
                 <w:sz w:val="18"/>
                 <w:lang w:val="es-AR"/>
               </w:rPr>
-              <w:t>Debe ser rechazado (supera 200 kg)</w:t>
+              <w:t>Debe ser rechazado (no entra en el furgón de 600 kg)</w:t>
             </w:r>
           </w:p>
         </w:tc>
@@ -4310,7 +4646,7 @@
                 <w:sz w:val="17"/>
                 <w:lang w:val="es-AR"/>
               </w:rPr>
-              <w:t>Envíos #1 a #4 de la tabla 4.4 (45+40+5+60 = 150 kg)</w:t>
+              <w:t>Envíos #1 a #3 de la tabla 4.4 (600+600+600 = 1.800 kg)</w:t>
             </w:r>
           </w:p>
         </w:tc>
@@ -4337,7 +4673,7 @@
                 <w:sz w:val="17"/>
                 <w:lang w:val="es-AR"/>
               </w:rPr>
-              <w:t>Cargar los envíos #1, #2, #3 y #4 uno detrás del otro.</w:t>
+              <w:t>Cargar los envíos #1, #2 y #3 uno detrás del otro.</w:t>
             </w:r>
           </w:p>
         </w:tc>
@@ -4364,7 +4700,7 @@
                 <w:sz w:val="17"/>
                 <w:lang w:val="es-AR"/>
               </w:rPr>
-              <w:t>• Los cuatro quedan en el mismo camión (Camión #1).</w:t>
+              <w:t>• Los tres quedan en el mismo camión (Camión #1).</w:t>
             </w:r>
           </w:p>
           <w:p>
@@ -4379,7 +4715,7 @@
                 <w:sz w:val="17"/>
                 <w:lang w:val="es-AR"/>
               </w:rPr>
-              <w:t>• El cartel del camión muestra “150/200 kg”.</w:t>
+              <w:t>• El cartel del camión muestra “1800/2000 kg”.</w:t>
             </w:r>
           </w:p>
         </w:tc>
@@ -4466,7 +4802,7 @@
                 <w:sz w:val="17"/>
                 <w:lang w:val="es-AR"/>
               </w:rPr>
-              <w:t>Envío #5 (70 kg), cargado después de CC-03</w:t>
+              <w:t>Envío #4 (300 kg), cargado después de CC-03</w:t>
             </w:r>
           </w:p>
         </w:tc>
@@ -4493,7 +4829,7 @@
                 <w:sz w:val="17"/>
                 <w:lang w:val="es-AR"/>
               </w:rPr>
-              <w:t>Con el Camión #1 en 150 kg, cargar el envío #5 (70 kg).</w:t>
+              <w:t>Con el Camión #1 en 1.800 kg, cargar el envío #4 (300 kg).</w:t>
             </w:r>
           </w:p>
         </w:tc>
@@ -4520,7 +4856,7 @@
                 <w:sz w:val="17"/>
                 <w:lang w:val="es-AR"/>
               </w:rPr>
-              <w:t>• El sistema abre un Camión #2 solo, porque 150+70=220 kg supera el límite de 200 kg.</w:t>
+              <w:t>• El sistema abre un Camión #2 solo, porque 1.800+300=2.100 kg supera el límite de 2.000 kg.</w:t>
             </w:r>
           </w:p>
           <w:p>
@@ -4535,7 +4871,7 @@
                 <w:sz w:val="17"/>
                 <w:lang w:val="es-AR"/>
               </w:rPr>
-              <w:t>• El Camión #1 queda con 150 kg; el nuevo envío entra en el Camión #2.</w:t>
+              <w:t>• El Camión #1 queda con 1.800 kg; el nuevo envío entra en el Camión #2.</w:t>
             </w:r>
           </w:p>
         </w:tc>
@@ -4618,7 +4954,7 @@
               <w:rPr>
                 <w:sz w:val="17"/>
               </w:rPr>
-              <w:t>Envío #6 (250 kg)</w:t>
+              <w:t>Envío #7 (2.500 kg)</w:t>
             </w:r>
           </w:p>
         </w:tc>
@@ -4645,7 +4981,7 @@
                 <w:sz w:val="17"/>
                 <w:lang w:val="es-AR"/>
               </w:rPr>
-              <w:t>Intentar cargar un envío de 250 kg.</w:t>
+              <w:t>Intentar cargar un envío de 2.500 kg.</w:t>
             </w:r>
           </w:p>
         </w:tc>
@@ -4672,7 +5008,7 @@
                 <w:sz w:val="17"/>
                 <w:lang w:val="es-AR"/>
               </w:rPr>
-              <w:t>El sistema rechaza la carga: ningún camión puede llevar un paquete de más de 200 kg.</w:t>
+              <w:t>El sistema rechaza la carga: ningún camión puede llevar un paquete de más de 2.000 kg.</w:t>
             </w:r>
           </w:p>
         </w:tc>
@@ -4977,6 +5313,173 @@
                 <w:lang w:val="es-AR"/>
               </w:rPr>
               <w:t>Se muestra un código QR válido con el código del envío, para escanear en la sucursal.</w:t>
+            </w:r>
+          </w:p>
+        </w:tc>
+      </w:tr>
+      <w:tr>
+        <w:trPr>
+          <w:jc w:val="center"/>
+        </w:trPr>
+        <w:tc>
+          <w:tcPr>
+            <w:tcW w:w="907" w:type="dxa"/>
+            <w:tcBorders>
+              <w:top w:val="single" w:sz="4" w:space="0" w:color="B9C7D8"/>
+              <w:left w:val="single" w:sz="4" w:space="0" w:color="B9C7D8"/>
+              <w:bottom w:val="single" w:sz="4" w:space="0" w:color="B9C7D8"/>
+              <w:right w:val="single" w:sz="4" w:space="0" w:color="B9C7D8"/>
+            </w:tcBorders>
+            <w:shd w:val="clear" w:color="auto" w:fill="F3F7FC"/>
+            <w:vAlign w:val="center"/>
+          </w:tcPr>
+          <w:p>
+            <w:pPr>
+              <w:spacing w:before="20" w:after="20"/>
+              <w:jc w:val="center"/>
+            </w:pPr>
+            <w:r>
+              <w:rPr>
+                <w:b/>
+                <w:color w:val="0D3B6E"/>
+                <w:sz w:val="18"/>
+              </w:rPr>
+              <w:t>CC-08</w:t>
+            </w:r>
+          </w:p>
+        </w:tc>
+        <w:tc>
+          <w:tcPr>
+            <w:tcW w:w="2608" w:type="dxa"/>
+            <w:tcBorders>
+              <w:top w:val="single" w:sz="4" w:space="0" w:color="B9C7D8"/>
+              <w:left w:val="single" w:sz="4" w:space="0" w:color="B9C7D8"/>
+              <w:bottom w:val="single" w:sz="4" w:space="0" w:color="B9C7D8"/>
+              <w:right w:val="single" w:sz="4" w:space="0" w:color="B9C7D8"/>
+            </w:tcBorders>
+            <w:shd w:val="clear" w:color="auto" w:fill="F3F7FC"/>
+          </w:tcPr>
+          <w:p>
+            <w:pPr>
+              <w:spacing w:before="20" w:after="20"/>
+              <w:rPr>
+                <w:lang w:val="es-AR"/>
+              </w:rPr>
+            </w:pPr>
+            <w:r>
+              <w:rPr>
+                <w:b/>
+                <w:sz w:val="18"/>
+                <w:lang w:val="es-AR"/>
+              </w:rPr>
+              <w:t>Rechazo de un paquete a domicilio que no entra en el furgón</w:t>
+            </w:r>
+          </w:p>
+        </w:tc>
+        <w:tc>
+          <w:tcPr>
+            <w:tcW w:w="3175" w:type="dxa"/>
+            <w:tcBorders>
+              <w:top w:val="single" w:sz="4" w:space="0" w:color="B9C7D8"/>
+              <w:left w:val="single" w:sz="4" w:space="0" w:color="B9C7D8"/>
+              <w:bottom w:val="single" w:sz="4" w:space="0" w:color="B9C7D8"/>
+              <w:right w:val="single" w:sz="4" w:space="0" w:color="B9C7D8"/>
+            </w:tcBorders>
+            <w:shd w:val="clear" w:color="auto" w:fill="F3F7FC"/>
+          </w:tcPr>
+          <w:p>
+            <w:pPr>
+              <w:spacing w:before="20" w:after="20"/>
+            </w:pPr>
+            <w:r>
+              <w:rPr>
+                <w:sz w:val="17"/>
+              </w:rPr>
+              <w:t>Envío #8 (700 kg, entrega a domicilio)</w:t>
+            </w:r>
+          </w:p>
+        </w:tc>
+        <w:tc>
+          <w:tcPr>
+            <w:tcW w:w="4819" w:type="dxa"/>
+            <w:tcBorders>
+              <w:top w:val="single" w:sz="4" w:space="0" w:color="B9C7D8"/>
+              <w:left w:val="single" w:sz="4" w:space="0" w:color="B9C7D8"/>
+              <w:bottom w:val="single" w:sz="4" w:space="0" w:color="B9C7D8"/>
+              <w:right w:val="single" w:sz="4" w:space="0" w:color="B9C7D8"/>
+            </w:tcBorders>
+            <w:shd w:val="clear" w:color="auto" w:fill="F3F7FC"/>
+          </w:tcPr>
+          <w:p>
+            <w:pPr>
+              <w:spacing w:after="40"/>
+              <w:rPr>
+                <w:lang w:val="es-AR"/>
+              </w:rPr>
+            </w:pPr>
+            <w:r>
+              <w:rPr>
+                <w:sz w:val="17"/>
+                <w:lang w:val="es-AR"/>
+              </w:rPr>
+              <w:t>1. Intentar cargar un envío de 700 kg con modalidad “Entrega a domicilio”.</w:t>
+            </w:r>
+          </w:p>
+          <w:p>
+            <w:pPr>
+              <w:spacing w:after="40"/>
+              <w:rPr>
+                <w:lang w:val="es-AR"/>
+              </w:rPr>
+            </w:pPr>
+            <w:r>
+              <w:rPr>
+                <w:sz w:val="17"/>
+                <w:lang w:val="es-AR"/>
+              </w:rPr>
+              <w:t>2. Repetir el mismo envío con modalidad “Retiro en sucursal”.</w:t>
+            </w:r>
+          </w:p>
+        </w:tc>
+        <w:tc>
+          <w:tcPr>
+            <w:tcW w:w="3798" w:type="dxa"/>
+            <w:tcBorders>
+              <w:top w:val="single" w:sz="4" w:space="0" w:color="B9C7D8"/>
+              <w:left w:val="single" w:sz="4" w:space="0" w:color="B9C7D8"/>
+              <w:bottom w:val="single" w:sz="4" w:space="0" w:color="B9C7D8"/>
+              <w:right w:val="single" w:sz="4" w:space="0" w:color="B9C7D8"/>
+            </w:tcBorders>
+            <w:shd w:val="clear" w:color="auto" w:fill="F3F7FC"/>
+          </w:tcPr>
+          <w:p>
+            <w:pPr>
+              <w:spacing w:after="40"/>
+              <w:rPr>
+                <w:lang w:val="es-AR"/>
+              </w:rPr>
+            </w:pPr>
+            <w:r>
+              <w:rPr>
+                <w:sz w:val="17"/>
+                <w:lang w:val="es-AR"/>
+              </w:rPr>
+              <w:t>• Con entrega a domicilio el sistema lo rechaza: no entra en el furgón de reparto (máximo 600 kg).</w:t>
+            </w:r>
+          </w:p>
+          <w:p>
+            <w:pPr>
+              <w:spacing w:after="40"/>
+              <w:rPr>
+                <w:lang w:val="es-AR"/>
+              </w:rPr>
+            </w:pPr>
+            <w:r>
+              <w:rPr>
+                <w:sz w:val="17"/>
+                <w:lang w:val="es-AR"/>
+              </w:rPr>
+              <w:t>• Como retiro en sucursal sí se acepta.</w:t>
             </w:r>
           </w:p>
         </w:tc>
@@ -6660,6 +7163,218 @@
           </w:p>
         </w:tc>
       </w:tr>
+      <w:tr>
+        <w:trPr>
+          <w:jc w:val="center"/>
+        </w:trPr>
+        <w:tc>
+          <w:tcPr>
+            <w:tcW w:w="907" w:type="dxa"/>
+            <w:tcBorders>
+              <w:top w:val="single" w:sz="4" w:space="0" w:color="B9C7D8"/>
+              <w:left w:val="single" w:sz="4" w:space="0" w:color="B9C7D8"/>
+              <w:bottom w:val="single" w:sz="4" w:space="0" w:color="B9C7D8"/>
+              <w:right w:val="single" w:sz="4" w:space="0" w:color="B9C7D8"/>
+            </w:tcBorders>
+            <w:shd w:val="clear" w:color="auto" w:fill="FFFFFF"/>
+            <w:vAlign w:val="center"/>
+          </w:tcPr>
+          <w:p>
+            <w:pPr>
+              <w:spacing w:before="20" w:after="20"/>
+              <w:jc w:val="center"/>
+            </w:pPr>
+            <w:r>
+              <w:rPr>
+                <w:b/>
+                <w:color w:val="0D3B6E"/>
+                <w:sz w:val="18"/>
+              </w:rPr>
+              <w:t>EMP-11</w:t>
+            </w:r>
+          </w:p>
+        </w:tc>
+        <w:tc>
+          <w:tcPr>
+            <w:tcW w:w="2608" w:type="dxa"/>
+            <w:tcBorders>
+              <w:top w:val="single" w:sz="4" w:space="0" w:color="B9C7D8"/>
+              <w:left w:val="single" w:sz="4" w:space="0" w:color="B9C7D8"/>
+              <w:bottom w:val="single" w:sz="4" w:space="0" w:color="B9C7D8"/>
+              <w:right w:val="single" w:sz="4" w:space="0" w:color="B9C7D8"/>
+            </w:tcBorders>
+            <w:shd w:val="clear" w:color="auto" w:fill="FFFFFF"/>
+          </w:tcPr>
+          <w:p>
+            <w:pPr>
+              <w:spacing w:before="20" w:after="20"/>
+            </w:pPr>
+            <w:r>
+              <w:rPr>
+                <w:b/>
+                <w:sz w:val="18"/>
+              </w:rPr>
+              <w:t>Furgón lleno: el resto espera a la próxima salida</w:t>
+            </w:r>
+          </w:p>
+        </w:tc>
+        <w:tc>
+          <w:tcPr>
+            <w:tcW w:w="3175" w:type="dxa"/>
+            <w:tcBorders>
+              <w:top w:val="single" w:sz="4" w:space="0" w:color="B9C7D8"/>
+              <w:left w:val="single" w:sz="4" w:space="0" w:color="B9C7D8"/>
+              <w:bottom w:val="single" w:sz="4" w:space="0" w:color="B9C7D8"/>
+              <w:right w:val="single" w:sz="4" w:space="0" w:color="B9C7D8"/>
+            </w:tcBorders>
+            <w:shd w:val="clear" w:color="auto" w:fill="FFFFFF"/>
+          </w:tcPr>
+          <w:p>
+            <w:pPr>
+              <w:spacing w:before="20" w:after="20"/>
+              <w:rPr>
+                <w:lang w:val="es-AR"/>
+              </w:rPr>
+            </w:pPr>
+            <w:r>
+              <w:rPr>
+                <w:sz w:val="17"/>
+                <w:lang w:val="es-AR"/>
+              </w:rPr>
+              <w:t>Envíos #4, #5 y #6 de la tabla 4.4 en sucursal, a domicilio y con dirección en la misma zona (300+250+200 = 750 kg)</w:t>
+            </w:r>
+          </w:p>
+        </w:tc>
+        <w:tc>
+          <w:tcPr>
+            <w:tcW w:w="4819" w:type="dxa"/>
+            <w:tcBorders>
+              <w:top w:val="single" w:sz="4" w:space="0" w:color="B9C7D8"/>
+              <w:left w:val="single" w:sz="4" w:space="0" w:color="B9C7D8"/>
+              <w:bottom w:val="single" w:sz="4" w:space="0" w:color="B9C7D8"/>
+              <w:right w:val="single" w:sz="4" w:space="0" w:color="B9C7D8"/>
+            </w:tcBorders>
+            <w:shd w:val="clear" w:color="auto" w:fill="FFFFFF"/>
+          </w:tcPr>
+          <w:p>
+            <w:pPr>
+              <w:spacing w:after="40"/>
+              <w:rPr>
+                <w:lang w:val="es-AR"/>
+              </w:rPr>
+            </w:pPr>
+            <w:r>
+              <w:rPr>
+                <w:sz w:val="17"/>
+                <w:lang w:val="es-AR"/>
+              </w:rPr>
+              <w:t>1. Ir a “Preparar reparto”: la zona muestra “Furgón: X / 600 kg” y, en una lista aparte, el paquete que no entra.</w:t>
+            </w:r>
+          </w:p>
+          <w:p>
+            <w:pPr>
+              <w:spacing w:after="40"/>
+              <w:rPr>
+                <w:lang w:val="es-AR"/>
+              </w:rPr>
+            </w:pPr>
+            <w:r>
+              <w:rPr>
+                <w:sz w:val="17"/>
+                <w:lang w:val="es-AR"/>
+              </w:rPr>
+              <w:t>2. Presionar “Salir a reparto” en esa zona.</w:t>
+            </w:r>
+          </w:p>
+          <w:p>
+            <w:pPr>
+              <w:spacing w:after="40"/>
+              <w:rPr>
+                <w:lang w:val="es-AR"/>
+              </w:rPr>
+            </w:pPr>
+            <w:r>
+              <w:rPr>
+                <w:sz w:val="17"/>
+                <w:lang w:val="es-AR"/>
+              </w:rPr>
+              <w:t>3. Presionar “Salir a reparto” otra vez con el furgón lleno.</w:t>
+            </w:r>
+          </w:p>
+          <w:p>
+            <w:pPr>
+              <w:spacing w:after="40"/>
+              <w:rPr>
+                <w:lang w:val="es-AR"/>
+              </w:rPr>
+            </w:pPr>
+            <w:r>
+              <w:rPr>
+                <w:sz w:val="17"/>
+                <w:lang w:val="es-AR"/>
+              </w:rPr>
+              <w:t>4. Marcar uno de los paquetes que salieron como entregado y volver a presionar “Salir a reparto”.</w:t>
+            </w:r>
+          </w:p>
+        </w:tc>
+        <w:tc>
+          <w:tcPr>
+            <w:tcW w:w="3798" w:type="dxa"/>
+            <w:tcBorders>
+              <w:top w:val="single" w:sz="4" w:space="0" w:color="B9C7D8"/>
+              <w:left w:val="single" w:sz="4" w:space="0" w:color="B9C7D8"/>
+              <w:bottom w:val="single" w:sz="4" w:space="0" w:color="B9C7D8"/>
+              <w:right w:val="single" w:sz="4" w:space="0" w:color="B9C7D8"/>
+            </w:tcBorders>
+            <w:shd w:val="clear" w:color="auto" w:fill="FFFFFF"/>
+          </w:tcPr>
+          <w:p>
+            <w:pPr>
+              <w:spacing w:after="40"/>
+              <w:rPr>
+                <w:lang w:val="es-AR"/>
+              </w:rPr>
+            </w:pPr>
+            <w:r>
+              <w:rPr>
+                <w:sz w:val="17"/>
+                <w:lang w:val="es-AR"/>
+              </w:rPr>
+              <w:t>• Salen dos paquetes (entre 450 y 550 kg) y el tercero queda en sucursal para la próxima salida.</w:t>
+            </w:r>
+          </w:p>
+          <w:p>
+            <w:pPr>
+              <w:spacing w:after="40"/>
+              <w:rPr>
+                <w:lang w:val="es-AR"/>
+              </w:rPr>
+            </w:pPr>
+            <w:r>
+              <w:rPr>
+                <w:sz w:val="17"/>
+                <w:lang w:val="es-AR"/>
+              </w:rPr>
+              <w:t>• Con el furgón lleno el sistema avisa y no saca nada más.</w:t>
+            </w:r>
+          </w:p>
+          <w:p>
+            <w:pPr>
+              <w:spacing w:after="40"/>
+              <w:rPr>
+                <w:lang w:val="es-AR"/>
+              </w:rPr>
+            </w:pPr>
+            <w:r>
+              <w:rPr>
+                <w:sz w:val="17"/>
+                <w:lang w:val="es-AR"/>
+              </w:rPr>
+              <w:t>• Al entregar un paquete se libera lugar y el que esperaba sale en la nueva salida.</w:t>
+            </w:r>
+          </w:p>
+        </w:tc>
+      </w:tr>
     </w:tbl>
     <w:p>
       <w:pPr>
@@ -9421,7 +10136,7 @@
                 <w:sz w:val="17"/>
                 <w:lang w:val="es-AR"/>
               </w:rPr>
-              <w:t>2. Cargar patente, marca, modelo, tipo y asignarlo a un empleado.</w:t>
+              <w:t>2. Cargar patente, marca, modelo, tipo (el único disponible es Furgón) y asignarlo a un empleado.</w:t>
             </w:r>
           </w:p>
         </w:tc>

</xml_diff>